<commit_message>
Respect iPhone safe areas and prepare Votiva 1.0.1
</commit_message>
<xml_diff>
--- a/docs/documents/RegistroMedia-Documentazione-Completa.docx
+++ b/docs/documents/RegistroMedia-Documentazione-Completa.docx
@@ -28,7 +28,7 @@
     </w:p>
     <w:p>
       <w:r>
-        <w:t>Software 1.0.0 · Registro personale offline</w:t>
+        <w:t>Software 1.0.1 · Registro personale offline</w:t>
         <w:br/>
         <w:t>Windows · Android · Frontend web</w:t>
       </w:r>
@@ -40,7 +40,7 @@
     </w:p>
     <w:p>
       <w:r>
-        <w:t>Perimetro: Votiva 1.0.0. Stati realizzati, verifiche e attività future esplicitamente distinti.</w:t>
+        <w:t>Perimetro: Votiva 1.0.1. Stati realizzati, verifiche e attività future esplicitamente distinti.</w:t>
       </w:r>
     </w:p>
     <w:p>
@@ -64,7 +64,7 @@
     <w:p>
       <w:pPr/>
       <w:r>
-        <w:t>Documento 2.0 · 30 ottobre 2026 · software 1.0.0. Sostituisce la relazione della versione 0.4.0. Il documento descrive lo stato implementato e distingue i controlli automatici dalle verifiche ancora necessarie.</w:t>
+        <w:t>Documento 2.0 · 30 ottobre 2026 · software 1.0.1. Sostituisce la relazione della versione 0.4.0. Il documento descrive lo stato implementato e distingue i controlli automatici dalle verifiche ancora necessarie.</w:t>
       </w:r>
     </w:p>
     <w:p>
@@ -2414,7 +2414,7 @@
     <w:p>
       <w:pPr/>
       <w:r>
-        <w:t>Documento 2.0 · 30 ottobre 2026 · software 1.0.0. Sostituisce la WBS 0.4; le funzionalità ritirate non sono più deliverable del prodotto.</w:t>
+        <w:t>Documento 2.0 · 30 ottobre 2026 · software 1.0.1. Sostituisce la WBS 0.4; le funzionalità ritirate non sono più deliverable del prodotto.</w:t>
       </w:r>
     </w:p>
     <w:p>
@@ -4265,7 +4265,7 @@
         <w:color w:val="626E80"/>
         <w:sz w:val="16"/>
       </w:rPr>
-      <w:t>VOTIVA  /  RELAZIONE E WBS  /  SOFTWARE 1.0.0</w:t>
+      <w:t>VOTIVA  /  RELAZIONE E WBS  /  SOFTWARE 1.0.1</w:t>
     </w:r>
   </w:p>
 </w:hdr>

</xml_diff>